<commit_message>
docs: update some specific objectives and possible implementations
</commit_message>
<xml_diff>
--- a/documentacion/Anteproyecto.docx
+++ b/documentacion/Anteproyecto.docx
@@ -542,6 +542,7 @@
           <w:sz w:val="24"/>
           <w:szCs w:val="24"/>
           <w:highlight w:val="none"/>
+          <w:lang w:val="es-ES"/>
         </w:rPr>
       </w:r>
       <w:r>
@@ -617,13 +618,14 @@
           <w:highlight w:val="none"/>
           <w:lang w:val="es-ES"/>
         </w:rPr>
-        <w:t xml:space="preserve">DAM VESPERTIDO</w:t>
+        <w:t xml:space="preserve">DESARROLLO DE APLICACIONES MULTIPLATAFORMA VESPERTIDO</w:t>
       </w:r>
       <w:r>
         <w:rPr>
           <w:sz w:val="24"/>
           <w:szCs w:val="24"/>
           <w:highlight w:val="none"/>
+          <w:lang w:val="es-ES"/>
         </w:rPr>
       </w:r>
       <w:r>
@@ -734,7 +736,7 @@
           <w:highlight w:val="none"/>
           <w:lang w:val="es-ES"/>
         </w:rPr>
-        <w:t xml:space="preserve">DICIEMBRE 2025</w:t>
+        <w:t xml:space="preserve">ENERO 2026</w:t>
       </w:r>
       <w:r>
         <w:rPr>
@@ -743,7 +745,6 @@
           <w:sz w:val="24"/>
           <w:szCs w:val="24"/>
           <w:highlight w:val="none"/>
-          <w:lang w:val="es-ES"/>
         </w:rPr>
       </w:r>
       <w:r>
@@ -785,7 +786,7 @@
       <w:r>
         <w:rPr>
           <w:highlight w:val="none"/>
-          <w:lang w:val="es-ES"/>
+          <w14:ligatures w14:val="none"/>
         </w:rPr>
       </w:r>
       <w:r>
@@ -879,7 +880,7 @@
           <w:highlight w:val="none"/>
           <w:lang w:val="es-ES"/>
         </w:rPr>
-        <w:t xml:space="preserve">ste proyecto nace de la necesidad de eliminar estas barreras, ofreciendo una solución móvil nativa en Android que empodere al usuario final. El objetivo principal es dotar al deportista de una herramienta intuitiva que le permita visualizar la disponibilid</w:t>
+        <w:t xml:space="preserve">ste proyecto nace de la necesidad de eliminar estas barreras, ofreciendo una solución móvil nativa en Android. El objetivo principal es aportar al deportista de una herramienta intuitiva que le permita visualizar la disponibilid</w:t>
       </w:r>
       <w:r>
         <w:rPr>
@@ -888,7 +889,7 @@
           <w:highlight w:val="none"/>
           <w:lang w:val="es-ES"/>
         </w:rPr>
-        <w:t xml:space="preserve">ad de pistas en tiempo real y gestionar sus reservas de forma autónoma, segura e instantánea, mejorando drásticamente su experiencia y optimizando, a su vez, el flujo operativo del centro deportivo.</w:t>
+        <w:t xml:space="preserve">ad de pistas en tiempo real y gestionar sus reservas de forma independiente, segura e instantánea, mejorando notablemente su experiencia y optimizando, a su vez, el flujo operativo del centro deportivo.</w:t>
       </w:r>
       <w:r>
         <w:rPr>
@@ -1173,7 +1174,7 @@
           <w:sz w:val="28"/>
           <w:szCs w:val="28"/>
           <w:highlight w:val="none"/>
-          <w:lang w:val="es-ES"/>
+          <w:lang w:val="es-ES" w:bidi="es-ES"/>
         </w:rPr>
       </w:r>
       <w:r>
@@ -1207,7 +1208,7 @@
       <w:r>
         <w:rPr>
           <w:highlight w:val="none"/>
-          <w:lang w:val="es-ES"/>
+          <w14:ligatures w14:val="none"/>
         </w:rPr>
       </w:r>
       <w:r>
@@ -1270,8 +1271,34 @@
           <w:sz w:val="24"/>
           <w:szCs w:val="24"/>
           <w:highlight w:val="none"/>
+          <w:lang w:val="es-ES" w:bidi="es-ES"/>
+        </w:rPr>
+      </w:r>
+      <w:r>
+        <w:rPr>
+          <w:sz w:val="24"/>
+          <w:szCs w:val="24"/>
+          <w:highlight w:val="none"/>
           <w:lang w:val="es-ES"/>
         </w:rPr>
+      </w:r>
+    </w:p>
+    <w:p>
+      <w:pPr>
+        <w:pBdr/>
+        <w:spacing/>
+        <w:ind/>
+        <w:jc w:val="both"/>
+        <w:rPr/>
+      </w:pPr>
+      <w:r>
+        <w:rPr>
+          <w:sz w:val="24"/>
+          <w:szCs w:val="24"/>
+          <w:highlight w:val="none"/>
+          <w:lang w:val="es-ES" w:bidi="es-ES"/>
+        </w:rPr>
+        <w:t xml:space="preserve">Aunque tradicionalmente la gestión de centros deportivos se realiza desde ordenadores de escritorio, este proyecto se enfoca en la movilidad del gestor.</w:t>
       </w:r>
       <w:r>
         <w:rPr>
@@ -1281,6 +1308,7 @@
           <w:lang w:val="es-ES" w:bidi="es-ES"/>
         </w:rPr>
       </w:r>
+      <w:r/>
     </w:p>
     <w:p>
       <w:pPr>
@@ -1288,7 +1316,12 @@
         <w:spacing/>
         <w:ind/>
         <w:jc w:val="both"/>
-        <w:rPr/>
+        <w:rPr>
+          <w:sz w:val="24"/>
+          <w:szCs w:val="24"/>
+          <w:highlight w:val="none"/>
+          <w:lang w:val="es-ES" w:bidi="es-ES"/>
+        </w:rPr>
       </w:pPr>
       <w:r>
         <w:rPr>
@@ -1297,9 +1330,8 @@
           <w:highlight w:val="none"/>
           <w:lang w:val="es-ES" w:bidi="es-ES"/>
         </w:rPr>
-        <w:t xml:space="preserve">Aunque tradicionalmente la gestión de centros deportivos se realiza desde ordenadores de escritorio, este proyecto se enfoca en la movilidad del gestor.</w:t>
+        <w:t xml:space="preserve">L</w:t>
       </w:r>
-      <w:r/>
       <w:r>
         <w:rPr>
           <w:sz w:val="24"/>
@@ -1307,38 +1339,7 @@
           <w:highlight w:val="none"/>
           <w:lang w:val="es-ES" w:bidi="es-ES"/>
         </w:rPr>
-      </w:r>
-      <w:r/>
-      <w:r>
-        <w:rPr>
-          <w:sz w:val="24"/>
-          <w:szCs w:val="24"/>
-          <w:highlight w:val="none"/>
-          <w:lang w:val="es-ES" w:bidi="es-ES"/>
-        </w:rPr>
-      </w:r>
-    </w:p>
-    <w:p>
-      <w:pPr>
-        <w:pBdr/>
-        <w:spacing/>
-        <w:ind/>
-        <w:jc w:val="both"/>
-        <w:rPr>
-          <w:sz w:val="24"/>
-          <w:szCs w:val="24"/>
-          <w:highlight w:val="none"/>
-          <w:lang w:val="es-ES" w:bidi="es-ES"/>
-        </w:rPr>
-      </w:pPr>
-      <w:r>
-        <w:rPr>
-          <w:sz w:val="24"/>
-          <w:szCs w:val="24"/>
-          <w:highlight w:val="none"/>
-          <w:lang w:val="es-ES" w:bidi="es-ES"/>
-        </w:rPr>
-        <w:t xml:space="preserve">La aplicación incluirá un Módulo de Administración Móvil diseñado para pequeños propietarios o encargados de pista que necesitan gestionar el centro 'a pie de campo', sin depender de una oficina física. Esto permite resolver incidencias, validar entradas y </w:t>
+        <w:t xml:space="preserve">a aplicación incluirá un Módulo de Administración Móvil diseñado para pequeños propietarios o encargados de pista que necesitan gestionar el centro “a pie de campo”, sin depender de una oficina física. Esto permite resolver incidencias, validar entradas y </w:t>
       </w:r>
       <w:r>
         <w:rPr>
@@ -1349,13 +1350,12 @@
         </w:rPr>
         <w:t xml:space="preserve">gestionar bloqueos de pista desde cualquier lugar del recinto</w:t>
       </w:r>
-      <w:r/>
       <w:r>
         <w:rPr>
           <w:sz w:val="24"/>
           <w:szCs w:val="24"/>
           <w:highlight w:val="none"/>
-          <w:lang w:val="es-ES" w:bidi="es-ES"/>
+          <w:lang w:val="es-ES"/>
         </w:rPr>
       </w:r>
       <w:r>
@@ -1364,14 +1364,6 @@
           <w:szCs w:val="24"/>
           <w:highlight w:val="none"/>
           <w:lang w:val="es-ES" w:bidi="es-ES"/>
-        </w:rPr>
-      </w:r>
-      <w:r>
-        <w:rPr>
-          <w:sz w:val="24"/>
-          <w:szCs w:val="24"/>
-          <w:highlight w:val="none"/>
-          <w:lang w:val="es-ES"/>
         </w:rPr>
       </w:r>
     </w:p>
@@ -1412,7 +1404,7 @@
           <w:sz w:val="24"/>
           <w:szCs w:val="24"/>
           <w:highlight w:val="none"/>
-          <w:lang w:val="es-ES"/>
+          <w:lang w:val="es-ES" w:bidi="es-ES"/>
         </w:rPr>
       </w:r>
       <w:r>
@@ -1543,7 +1535,7 @@
           <w:sz w:val="24"/>
           <w:szCs w:val="24"/>
           <w:highlight w:val="none"/>
-          <w:lang w:val="es-ES"/>
+          <w:lang w:val="es-ES" w:bidi="es-ES"/>
         </w:rPr>
       </w:r>
       <w:r>
@@ -1595,7 +1587,7 @@
           <w:sz w:val="24"/>
           <w:szCs w:val="24"/>
           <w:highlight w:val="none"/>
-          <w:lang w:val="es-ES"/>
+          <w:lang w:val="es-ES" w:bidi="es-ES"/>
         </w:rPr>
       </w:r>
       <w:r>
@@ -1640,15 +1632,16 @@
           <w:highlight w:val="none"/>
           <w:lang w:val="es-ES" w:bidi="es-ES"/>
         </w:rPr>
-        <w:t xml:space="preserve">Integrar una base de datos para la persistencia de datos en tiempo real.</w:t>
+        <w:t xml:space="preserve">Diseñar una arquitectura de datos híbrida, principalmente persistencia de datos en tiempo real, pero que contemple la persistencia local como valor añadido, garantizando la integridad de la información y permitiendo la disponibilidad de datos críticos de forma offline</w:t>
       </w:r>
       <w:r>
         <w:rPr>
           <w:sz w:val="24"/>
           <w:szCs w:val="24"/>
           <w:highlight w:val="none"/>
-          <w:lang w:val="es-ES"/>
+          <w:lang w:val="es-ES" w:bidi="es-ES"/>
         </w:rPr>
+        <w:t xml:space="preserve">.</w:t>
       </w:r>
       <w:r>
         <w:rPr>
@@ -1692,14 +1685,85 @@
           <w:highlight w:val="none"/>
           <w:lang w:val="es-ES" w:bidi="es-ES"/>
         </w:rPr>
-        <w:t xml:space="preserve">Implementar un módulo de pagos o registro de transacciones para llevar un control económico de las reservas.</w:t>
+        <w:t xml:space="preserve">Integrar un sistema de notificaciones push, preferiblemente usando la integraci</w:t>
       </w:r>
       <w:r>
         <w:rPr>
           <w:sz w:val="24"/>
           <w:szCs w:val="24"/>
           <w:highlight w:val="none"/>
-          <w:lang w:val="es-ES"/>
+          <w:lang w:val="es-ES" w:bidi="es-ES"/>
+        </w:rPr>
+        <w:t xml:space="preserve">ón con “</w:t>
+      </w:r>
+      <w:r>
+        <w:rPr>
+          <w:sz w:val="24"/>
+          <w:szCs w:val="24"/>
+          <w:highlight w:val="none"/>
+          <w:lang w:val="es-ES" w:bidi="es-ES"/>
+        </w:rPr>
+        <w:t xml:space="preserve">Firebase Cloud Messaging</w:t>
+      </w:r>
+      <w:r>
+        <w:rPr>
+          <w:sz w:val="24"/>
+          <w:szCs w:val="24"/>
+          <w:highlight w:val="none"/>
+          <w:lang w:val="es-ES" w:bidi="es-ES"/>
+        </w:rPr>
+        <w:t xml:space="preserve">”.</w:t>
+      </w:r>
+      <w:r>
+        <w:rPr>
+          <w:sz w:val="24"/>
+          <w:szCs w:val="24"/>
+          <w:highlight w:val="none"/>
+          <w:lang w:val="es-ES" w:bidi="es-ES"/>
+        </w:rPr>
+      </w:r>
+    </w:p>
+    <w:p>
+      <w:pPr>
+        <w:pStyle w:val="914"/>
+        <w:numPr>
+          <w:ilvl w:val="0"/>
+          <w:numId w:val="1"/>
+        </w:numPr>
+        <w:pBdr/>
+        <w:spacing/>
+        <w:ind/>
+        <w:jc w:val="both"/>
+        <w:rPr>
+          <w:sz w:val="24"/>
+          <w:szCs w:val="24"/>
+          <w:highlight w:val="none"/>
+          <w:lang w:val="es-ES" w:bidi="es-ES"/>
+        </w:rPr>
+      </w:pPr>
+      <w:r>
+        <w:rPr>
+          <w:sz w:val="24"/>
+          <w:szCs w:val="24"/>
+          <w:highlight w:val="none"/>
+          <w:lang w:val="es-ES" w:bidi="es-ES"/>
+        </w:rPr>
+      </w:r>
+      <w:r>
+        <w:rPr>
+          <w:sz w:val="24"/>
+          <w:szCs w:val="24"/>
+          <w:highlight w:val="none"/>
+          <w:lang w:val="es-ES" w:bidi="es-ES"/>
+        </w:rPr>
+        <w:t xml:space="preserve">Integrar un módulo de pagos mediante “Stripe Sandbox” como funcionalidad de valor añadido, con el fin de validar el flujo completo de usuario desde la reserva hasta la transacción económica.</w:t>
+      </w:r>
+      <w:r>
+        <w:rPr>
+          <w:sz w:val="24"/>
+          <w:szCs w:val="24"/>
+          <w:highlight w:val="none"/>
+          <w:lang w:val="es-ES" w:bidi="es-ES"/>
         </w:rPr>
       </w:r>
       <w:r>
@@ -1791,7 +1855,7 @@
           <w:sz w:val="28"/>
           <w:szCs w:val="28"/>
           <w:highlight w:val="none"/>
-          <w:lang w:val="es-ES"/>
+          <w:lang w:val="es-ES" w:bidi="es-ES"/>
         </w:rPr>
       </w:r>
       <w:r>
@@ -1834,7 +1898,25 @@
           <w:highlight w:val="none"/>
           <w:lang w:val="es-ES" w:bidi="es-ES"/>
         </w:rPr>
-        <w:t xml:space="preserve"> Ver disponibilidad, reservar, cancelar (con reglas), ver historial, perfil.</w:t>
+        <w:t xml:space="preserve"> Ver disponibilidad, reservar, cancelar reservas (con reglas como: horas de antelaci</w:t>
+      </w:r>
+      <w:r>
+        <w:rPr>
+          <w:sz w:val="24"/>
+          <w:szCs w:val="24"/>
+          <w:highlight w:val="none"/>
+          <w:lang w:val="es-ES" w:bidi="es-ES"/>
+        </w:rPr>
+        <w:t xml:space="preserve">ón, etc.</w:t>
+      </w:r>
+      <w:r>
+        <w:rPr>
+          <w:sz w:val="24"/>
+          <w:szCs w:val="24"/>
+          <w:highlight w:val="none"/>
+          <w:lang w:val="es-ES" w:bidi="es-ES"/>
+        </w:rPr>
+        <w:t xml:space="preserve">), ver historial, perfil.</w:t>
       </w:r>
       <w:r>
         <w:rPr>
@@ -1925,7 +2007,25 @@
           <w:highlight w:val="none"/>
           <w:lang w:val="es-ES" w:bidi="es-ES"/>
         </w:rPr>
-        <w:t xml:space="preserve"> La aplicación requiere conexión a internet. No se integrará con hardware físico (tornos de entrada). Los pagos serán simulados gracias a Stripe Sandbox.</w:t>
+        <w:t xml:space="preserve"> La aplicación requiere conexión a internet (posibilidad de funcionamiento sin conexi</w:t>
+      </w:r>
+      <w:r>
+        <w:rPr>
+          <w:sz w:val="24"/>
+          <w:szCs w:val="24"/>
+          <w:highlight w:val="none"/>
+          <w:lang w:val="es-ES" w:bidi="es-ES"/>
+        </w:rPr>
+        <w:t xml:space="preserve">ón gracias a una base de datos local)</w:t>
+      </w:r>
+      <w:r>
+        <w:rPr>
+          <w:sz w:val="24"/>
+          <w:szCs w:val="24"/>
+          <w:highlight w:val="none"/>
+          <w:lang w:val="es-ES" w:bidi="es-ES"/>
+        </w:rPr>
+        <w:t xml:space="preserve">. No se integrará con hardware físico (tornos de entrada). Los pagos serán simulados gracias a Stripe Sandbox.</w:t>
       </w:r>
       <w:r>
         <w:rPr>
@@ -1990,7 +2090,7 @@
           <w:sz w:val="28"/>
           <w:szCs w:val="28"/>
           <w:highlight w:val="none"/>
-          <w:lang w:val="es-ES"/>
+          <w:lang w:val="es-ES" w:bidi="es-ES"/>
         </w:rPr>
       </w:r>
       <w:r>
@@ -2089,23 +2189,6 @@
         </w:rPr>
         <w:t xml:space="preserve"> MVVM (Model-View-ViewModel) con Clean Architecture.</w:t>
       </w:r>
-      <w:r/>
-      <w:r>
-        <w:rPr>
-          <w:sz w:val="24"/>
-          <w:szCs w:val="24"/>
-          <w:highlight w:val="none"/>
-          <w:lang w:val="es-ES" w:bidi="es-ES"/>
-        </w:rPr>
-      </w:r>
-      <w:r>
-        <w:rPr>
-          <w:sz w:val="24"/>
-          <w:szCs w:val="24"/>
-          <w:highlight w:val="none"/>
-          <w:lang w:val="es-ES" w:bidi="es-ES"/>
-        </w:rPr>
-      </w:r>
       <w:r>
         <w:rPr>
           <w:sz w:val="24"/>
@@ -2203,14 +2286,7 @@
           <w:lang w:val="es-ES" w:bidi="es-ES"/>
         </w:rPr>
       </w:r>
-      <w:r>
-        <w:rPr>
-          <w:sz w:val="24"/>
-          <w:szCs w:val="24"/>
-          <w:highlight w:val="none"/>
-          <w:lang w:val="es-ES" w:bidi="es-ES"/>
-        </w:rPr>
-      </w:r>
+      <w:r/>
     </w:p>
     <w:p>
       <w:pPr>
@@ -2269,8 +2345,72 @@
     </w:p>
     <w:p>
       <w:pPr>
-        <w:pBdr/>
-        <w:shd w:val="nil"/>
+        <w:pStyle w:val="914"/>
+        <w:numPr>
+          <w:ilvl w:val="0"/>
+          <w:numId w:val="3"/>
+        </w:numPr>
+        <w:pBdr/>
+        <w:spacing/>
+        <w:ind/>
+        <w:jc w:val="both"/>
+        <w:rPr>
+          <w:sz w:val="24"/>
+          <w:szCs w:val="24"/>
+          <w:highlight w:val="none"/>
+          <w:lang w:val="es-ES"/>
+        </w:rPr>
+      </w:pPr>
+      <w:r>
+        <w:rPr>
+          <w:b/>
+          <w:bCs/>
+          <w:sz w:val="24"/>
+          <w:szCs w:val="24"/>
+          <w:highlight w:val="none"/>
+          <w:lang w:val="es-ES" w:bidi="es-ES"/>
+        </w:rPr>
+        <w:t xml:space="preserve">Notificaciones:</w:t>
+      </w:r>
+      <w:r>
+        <w:rPr>
+          <w:sz w:val="24"/>
+          <w:szCs w:val="24"/>
+          <w:highlight w:val="none"/>
+          <w:lang w:val="es-ES" w:bidi="es-ES"/>
+        </w:rPr>
+        <w:t xml:space="preserve"> </w:t>
+      </w:r>
+      <w:r>
+        <w:rPr>
+          <w:sz w:val="24"/>
+          <w:szCs w:val="24"/>
+          <w:highlight w:val="none"/>
+          <w:lang w:val="es-ES" w:bidi="es-ES"/>
+        </w:rPr>
+        <w:t xml:space="preserve">Firebase Cloud Messaging</w:t>
+      </w:r>
+      <w:r>
+        <w:rPr>
+          <w:sz w:val="24"/>
+          <w:szCs w:val="24"/>
+          <w:highlight w:val="none"/>
+          <w:lang w:val="es-ES" w:bidi="es-ES"/>
+        </w:rPr>
+      </w:r>
+      <w:r>
+        <w:rPr>
+          <w:sz w:val="24"/>
+          <w:szCs w:val="24"/>
+          <w:highlight w:val="none"/>
+          <w:lang w:val="es-ES"/>
+        </w:rPr>
+      </w:r>
+    </w:p>
+    <w:p>
+      <w:pPr>
+        <w:pBdr/>
+        <w:shd w:val="nil" w:color="auto"/>
         <w:spacing/>
         <w:ind/>
         <w:rPr>
@@ -2333,7 +2473,7 @@
           <w:sz w:val="28"/>
           <w:szCs w:val="28"/>
           <w:highlight w:val="none"/>
-          <w:lang w:val="es-ES"/>
+          <w:lang w:val="es-ES" w:bidi="es-ES"/>
         </w:rPr>
       </w:r>
       <w:r>
@@ -2407,6 +2547,12 @@
                 <w:szCs w:val="24"/>
               </w:rPr>
               <w:t xml:space="preserve">Fase</w:t>
+            </w:r>
+            <w:r>
+              <w:rPr>
+                <w:sz w:val="24"/>
+                <w:szCs w:val="24"/>
+              </w:rPr>
             </w:r>
             <w:r>
               <w:rPr>
@@ -2462,6 +2608,12 @@
                 <w:szCs w:val="24"/>
               </w:rPr>
             </w:r>
+            <w:r>
+              <w:rPr>
+                <w:sz w:val="24"/>
+                <w:szCs w:val="24"/>
+              </w:rPr>
+            </w:r>
           </w:p>
         </w:tc>
         <w:tc>
@@ -2510,6 +2662,12 @@
                 <w:szCs w:val="24"/>
               </w:rPr>
             </w:r>
+            <w:r>
+              <w:rPr>
+                <w:sz w:val="24"/>
+                <w:szCs w:val="24"/>
+              </w:rPr>
+            </w:r>
           </w:p>
         </w:tc>
       </w:tr>
@@ -2541,6 +2699,7 @@
               <w:pBdr/>
               <w:spacing w:after="0" w:before="0" w:line="240" w:lineRule="auto"/>
               <w:ind/>
+              <w:jc w:val="center"/>
               <w:rPr>
                 <w:sz w:val="24"/>
                 <w:szCs w:val="24"/>
@@ -2555,6 +2714,12 @@
                 <w:szCs w:val="24"/>
               </w:rPr>
               <w:t xml:space="preserve">Análisis y Diseño</w:t>
+            </w:r>
+            <w:r>
+              <w:rPr>
+                <w:sz w:val="24"/>
+                <w:szCs w:val="24"/>
+              </w:rPr>
             </w:r>
             <w:r>
               <w:rPr>
@@ -2677,6 +2842,7 @@
               <w:pBdr/>
               <w:spacing w:after="0" w:before="0" w:line="240" w:lineRule="auto"/>
               <w:ind/>
+              <w:jc w:val="center"/>
               <w:rPr>
                 <w:sz w:val="24"/>
                 <w:szCs w:val="24"/>
@@ -2691,6 +2857,12 @@
                 <w:szCs w:val="24"/>
               </w:rPr>
               <w:t xml:space="preserve">Configuración</w:t>
+            </w:r>
+            <w:r>
+              <w:rPr>
+                <w:sz w:val="24"/>
+                <w:szCs w:val="24"/>
+              </w:rPr>
             </w:r>
             <w:r>
               <w:rPr>
@@ -2804,6 +2976,7 @@
               <w:pBdr/>
               <w:spacing w:after="0" w:before="0" w:line="240" w:lineRule="auto"/>
               <w:ind/>
+              <w:jc w:val="center"/>
               <w:rPr>
                 <w:sz w:val="24"/>
                 <w:szCs w:val="24"/>
@@ -2818,6 +2991,12 @@
                 <w:szCs w:val="24"/>
               </w:rPr>
               <w:t xml:space="preserve">Desarrollo Core</w:t>
+            </w:r>
+            <w:r>
+              <w:rPr>
+                <w:sz w:val="24"/>
+                <w:szCs w:val="24"/>
+              </w:rPr>
             </w:r>
             <w:r>
               <w:rPr>
@@ -2931,6 +3110,7 @@
               <w:pBdr/>
               <w:spacing w:after="0" w:before="0" w:line="240" w:lineRule="auto"/>
               <w:ind/>
+              <w:jc w:val="center"/>
               <w:rPr>
                 <w:sz w:val="24"/>
                 <w:szCs w:val="24"/>
@@ -2945,6 +3125,12 @@
                 <w:szCs w:val="24"/>
               </w:rPr>
               <w:t xml:space="preserve">Funcionalidades Extra</w:t>
+            </w:r>
+            <w:r>
+              <w:rPr>
+                <w:sz w:val="24"/>
+                <w:szCs w:val="24"/>
+              </w:rPr>
             </w:r>
             <w:r>
               <w:rPr>
@@ -3058,6 +3244,7 @@
               <w:pBdr/>
               <w:spacing w:after="0" w:before="0" w:line="240" w:lineRule="auto"/>
               <w:ind/>
+              <w:jc w:val="center"/>
               <w:rPr>
                 <w:sz w:val="24"/>
                 <w:szCs w:val="24"/>
@@ -3072,6 +3259,12 @@
                 <w:szCs w:val="24"/>
               </w:rPr>
               <w:t xml:space="preserve">Testing y Corrección</w:t>
+            </w:r>
+            <w:r>
+              <w:rPr>
+                <w:sz w:val="24"/>
+                <w:szCs w:val="24"/>
+              </w:rPr>
             </w:r>
             <w:r>
               <w:rPr>
@@ -3185,6 +3378,7 @@
               <w:pBdr/>
               <w:spacing w:after="0" w:before="0" w:line="240" w:lineRule="auto"/>
               <w:ind/>
+              <w:jc w:val="center"/>
               <w:rPr>
                 <w:sz w:val="24"/>
                 <w:szCs w:val="24"/>
@@ -3199,6 +3393,12 @@
                 <w:szCs w:val="24"/>
               </w:rPr>
               <w:t xml:space="preserve">Documentación</w:t>
+            </w:r>
+            <w:r>
+              <w:rPr>
+                <w:sz w:val="24"/>
+                <w:szCs w:val="24"/>
+              </w:rPr>
             </w:r>
             <w:r>
               <w:rPr>
@@ -3311,7 +3511,7 @@
           <w:sz w:val="24"/>
           <w:szCs w:val="24"/>
           <w:highlight w:val="none"/>
-          <w:lang w:val="es-ES" w:bidi="es-ES"/>
+          <w:lang w:val="es-ES"/>
         </w:rPr>
       </w:r>
       <w:r>

</xml_diff>